<commit_message>
State reports: drop catering where not provided; move media links and details to Annex A
Co-Authored-By: Claude Sonnet 5.5 <noreply@anthropic.com>
Claude-Session: https://claude.ai/code/session_01B6RPWkBpLKoctTdaNtAabD
</commit_message>
<xml_diff>
--- a/state_reports/Rasmi_Event_Management_Report_HoA_DRIVE_Banadir.docx
+++ b/state_reports/Rasmi_Event_Management_Report_HoA_DRIVE_Banadir.docx
@@ -1056,31 +1056,6 @@
     </w:p>
     <w:p>
       <w:pPr>
-        <w:pStyle w:val="ListBullet"/>
-      </w:pPr>
-      <w:r>
-        <w:rPr>
-          <w:rFonts w:ascii="Arial" w:hAnsi="Arial"/>
-          <w:b/>
-          <w:i w:val="0"/>
-          <w:color w:val="1B2610"/>
-          <w:sz w:val="20"/>
-        </w:rPr>
-        <w:t>Catering</w:t>
-      </w:r>
-      <w:r>
-        <w:rPr>
-          <w:rFonts w:ascii="Arial" w:hAnsi="Arial"/>
-          <w:b w:val="0"/>
-          <w:i w:val="0"/>
-          <w:color w:val="1B2610"/>
-          <w:sz w:val="20"/>
-        </w:rPr>
-        <w:t xml:space="preserve"> was not provided in Banadir (Mogadishu).</w:t>
-      </w:r>
-    </w:p>
-    <w:p>
-      <w:pPr>
         <w:pStyle w:val="Heading1"/>
       </w:pPr>
       <w:r>
@@ -1293,74 +1268,6 @@
                 <w:color w:val="1B2610"/>
                 <w:sz w:val="18"/>
               </w:rPr>
-              <w:t>Catering</w:t>
-            </w:r>
-          </w:p>
-        </w:tc>
-        <w:tc>
-          <w:tcPr>
-            <w:tcW w:type="dxa" w:w="4819"/>
-          </w:tcPr>
-          <w:p>
-            <w:pPr>
-              <w:keepNext/>
-              <w:spacing w:after="0"/>
-            </w:pPr>
-            <w:r>
-              <w:rPr>
-                <w:rFonts w:ascii="Arial" w:hAnsi="Arial"/>
-                <w:b w:val="0"/>
-                <w:i w:val="0"/>
-                <w:color w:val="1B2610"/>
-                <w:sz w:val="18"/>
-              </w:rPr>
-              <w:t>Refreshments for participants and guests at the ceremony.</w:t>
-            </w:r>
-          </w:p>
-        </w:tc>
-        <w:tc>
-          <w:tcPr>
-            <w:tcW w:type="dxa" w:w="1701"/>
-          </w:tcPr>
-          <w:p>
-            <w:pPr>
-              <w:keepNext/>
-              <w:spacing w:after="0"/>
-            </w:pPr>
-            <w:r>
-              <w:rPr>
-                <w:rFonts w:ascii="Arial" w:hAnsi="Arial"/>
-                <w:b w:val="0"/>
-                <w:i w:val="0"/>
-                <w:color w:val="1B2610"/>
-                <w:sz w:val="18"/>
-              </w:rPr>
-              <w:t>Not provided in this area</w:t>
-            </w:r>
-          </w:p>
-        </w:tc>
-      </w:tr>
-      <w:tr>
-        <w:trPr>
-          <w:cantSplit/>
-        </w:trPr>
-        <w:tc>
-          <w:tcPr>
-            <w:tcW w:type="dxa" w:w="2268"/>
-          </w:tcPr>
-          <w:p>
-            <w:pPr>
-              <w:keepNext/>
-              <w:spacing w:after="0"/>
-            </w:pPr>
-            <w:r>
-              <w:rPr>
-                <w:rFonts w:ascii="Arial" w:hAnsi="Arial"/>
-                <w:b w:val="0"/>
-                <w:i w:val="0"/>
-                <w:color w:val="1B2610"/>
-                <w:sz w:val="18"/>
-              </w:rPr>
               <w:t>Vehicle rent / transportation</w:t>
             </w:r>
           </w:p>
@@ -1448,7 +1355,7 @@
                 <w:color w:val="1B2610"/>
                 <w:sz w:val="18"/>
               </w:rPr>
-              <w:t>Photography and video coverage of the ceremony. All media is available through the link in Section 6.</w:t>
+              <w:t>Photography and video coverage of the ceremony. Links and details are in Annex A.</w:t>
             </w:r>
           </w:p>
         </w:tc>
@@ -1511,13 +1418,12 @@
       </w:tblPr>
       <w:tblGrid>
         <w:gridCol w:w="453"/>
-        <w:gridCol w:w="1814"/>
-        <w:gridCol w:w="1587"/>
+        <w:gridCol w:w="2041"/>
+        <w:gridCol w:w="1701"/>
+        <w:gridCol w:w="1247"/>
+        <w:gridCol w:w="1474"/>
         <w:gridCol w:w="1134"/>
-        <w:gridCol w:w="1247"/>
-        <w:gridCol w:w="907"/>
-        <w:gridCol w:w="1020"/>
-        <w:gridCol w:w="793"/>
+        <w:gridCol w:w="963"/>
       </w:tblGrid>
       <w:tr>
         <w:trPr>
@@ -1550,7 +1456,7 @@
         </w:tc>
         <w:tc>
           <w:tcPr>
-            <w:tcW w:type="dxa" w:w="1814"/>
+            <w:tcW w:type="dxa" w:w="2041"/>
             <w:tcBorders>
               <w:bottom w:val="single" w:sz="12" w:space="0" w:color="55891A"/>
             </w:tcBorders>
@@ -1574,7 +1480,7 @@
         </w:tc>
         <w:tc>
           <w:tcPr>
-            <w:tcW w:type="dxa" w:w="1587"/>
+            <w:tcW w:type="dxa" w:w="1701"/>
             <w:tcBorders>
               <w:bottom w:val="single" w:sz="12" w:space="0" w:color="55891A"/>
             </w:tcBorders>
@@ -1593,6 +1499,56 @@
                 <w:sz w:val="17"/>
               </w:rPr>
               <w:t>Date</w:t>
+            </w:r>
+          </w:p>
+        </w:tc>
+        <w:tc>
+          <w:tcPr>
+            <w:tcW w:type="dxa" w:w="1247"/>
+            <w:tcBorders>
+              <w:bottom w:val="single" w:sz="12" w:space="0" w:color="55891A"/>
+            </w:tcBorders>
+          </w:tcPr>
+          <w:p>
+            <w:pPr>
+              <w:keepNext/>
+              <w:spacing w:after="0"/>
+              <w:jc w:val="center"/>
+            </w:pPr>
+            <w:r>
+              <w:rPr>
+                <w:rFonts w:ascii="Arial" w:hAnsi="Arial"/>
+                <w:b/>
+                <w:i w:val="0"/>
+                <w:color w:val="55891A"/>
+                <w:sz w:val="17"/>
+              </w:rPr>
+              <w:t>Families</w:t>
+            </w:r>
+          </w:p>
+        </w:tc>
+        <w:tc>
+          <w:tcPr>
+            <w:tcW w:type="dxa" w:w="1474"/>
+            <w:tcBorders>
+              <w:bottom w:val="single" w:sz="12" w:space="0" w:color="55891A"/>
+            </w:tcBorders>
+          </w:tcPr>
+          <w:p>
+            <w:pPr>
+              <w:keepNext/>
+              <w:spacing w:after="0"/>
+              <w:jc w:val="center"/>
+            </w:pPr>
+            <w:r>
+              <w:rPr>
+                <w:rFonts w:ascii="Arial" w:hAnsi="Arial"/>
+                <w:b/>
+                <w:i w:val="0"/>
+                <w:color w:val="55891A"/>
+                <w:sz w:val="17"/>
+              </w:rPr>
+              <w:t>Fridge carrying</w:t>
             </w:r>
           </w:p>
         </w:tc>
@@ -1617,88 +1573,13 @@
                 <w:color w:val="55891A"/>
                 <w:sz w:val="17"/>
               </w:rPr>
-              <w:t>Families</w:t>
-            </w:r>
-          </w:p>
-        </w:tc>
-        <w:tc>
-          <w:tcPr>
-            <w:tcW w:type="dxa" w:w="1247"/>
-            <w:tcBorders>
-              <w:bottom w:val="single" w:sz="12" w:space="0" w:color="55891A"/>
-            </w:tcBorders>
-          </w:tcPr>
-          <w:p>
-            <w:pPr>
-              <w:keepNext/>
-              <w:spacing w:after="0"/>
-              <w:jc w:val="center"/>
-            </w:pPr>
-            <w:r>
-              <w:rPr>
-                <w:rFonts w:ascii="Arial" w:hAnsi="Arial"/>
-                <w:b/>
-                <w:i w:val="0"/>
-                <w:color w:val="55891A"/>
-                <w:sz w:val="17"/>
-              </w:rPr>
-              <w:t>Fridge carrying</w:t>
-            </w:r>
-          </w:p>
-        </w:tc>
-        <w:tc>
-          <w:tcPr>
-            <w:tcW w:type="dxa" w:w="907"/>
-            <w:tcBorders>
-              <w:bottom w:val="single" w:sz="12" w:space="0" w:color="55891A"/>
-            </w:tcBorders>
-          </w:tcPr>
-          <w:p>
-            <w:pPr>
-              <w:keepNext/>
-              <w:spacing w:after="0"/>
-              <w:jc w:val="center"/>
-            </w:pPr>
-            <w:r>
-              <w:rPr>
-                <w:rFonts w:ascii="Arial" w:hAnsi="Arial"/>
-                <w:b/>
-                <w:i w:val="0"/>
-                <w:color w:val="55891A"/>
-                <w:sz w:val="17"/>
-              </w:rPr>
-              <w:t>Catering</w:t>
-            </w:r>
-          </w:p>
-        </w:tc>
-        <w:tc>
-          <w:tcPr>
-            <w:tcW w:type="dxa" w:w="1020"/>
-            <w:tcBorders>
-              <w:bottom w:val="single" w:sz="12" w:space="0" w:color="55891A"/>
-            </w:tcBorders>
-          </w:tcPr>
-          <w:p>
-            <w:pPr>
-              <w:keepNext/>
-              <w:spacing w:after="0"/>
-              <w:jc w:val="center"/>
-            </w:pPr>
-            <w:r>
-              <w:rPr>
-                <w:rFonts w:ascii="Arial" w:hAnsi="Arial"/>
-                <w:b/>
-                <w:i w:val="0"/>
-                <w:color w:val="55891A"/>
-                <w:sz w:val="17"/>
-              </w:rPr>
               <w:t>Transport</w:t>
             </w:r>
           </w:p>
         </w:tc>
         <w:tc>
           <w:tcPr>
-            <w:tcW w:type="dxa" w:w="794"/>
+            <w:tcW w:type="dxa" w:w="964"/>
             <w:tcBorders>
               <w:bottom w:val="single" w:sz="12" w:space="0" w:color="55891A"/>
             </w:tcBorders>
@@ -1749,7 +1630,7 @@
         </w:tc>
         <w:tc>
           <w:tcPr>
-            <w:tcW w:type="dxa" w:w="1814"/>
+            <w:tcW w:type="dxa" w:w="2041"/>
           </w:tcPr>
           <w:p>
             <w:pPr>
@@ -1770,7 +1651,7 @@
         </w:tc>
         <w:tc>
           <w:tcPr>
-            <w:tcW w:type="dxa" w:w="1587"/>
+            <w:tcW w:type="dxa" w:w="1701"/>
           </w:tcPr>
           <w:p>
             <w:pPr>
@@ -1786,6 +1667,50 @@
                 <w:sz w:val="18"/>
               </w:rPr>
               <w:t>6 Sep 2026</w:t>
+            </w:r>
+          </w:p>
+        </w:tc>
+        <w:tc>
+          <w:tcPr>
+            <w:tcW w:type="dxa" w:w="1247"/>
+          </w:tcPr>
+          <w:p>
+            <w:pPr>
+              <w:keepNext/>
+              <w:spacing w:after="0"/>
+              <w:jc w:val="center"/>
+            </w:pPr>
+            <w:r>
+              <w:rPr>
+                <w:rFonts w:ascii="Arial" w:hAnsi="Arial"/>
+                <w:b w:val="0"/>
+                <w:i w:val="0"/>
+                <w:color w:val="1B2610"/>
+                <w:sz w:val="18"/>
+              </w:rPr>
+              <w:t>200</w:t>
+            </w:r>
+          </w:p>
+        </w:tc>
+        <w:tc>
+          <w:tcPr>
+            <w:tcW w:type="dxa" w:w="1474"/>
+          </w:tcPr>
+          <w:p>
+            <w:pPr>
+              <w:keepNext/>
+              <w:spacing w:after="0"/>
+              <w:jc w:val="center"/>
+            </w:pPr>
+            <w:r>
+              <w:rPr>
+                <w:rFonts w:ascii="Arial" w:hAnsi="Arial"/>
+                <w:b w:val="0"/>
+                <w:i w:val="0"/>
+                <w:color w:val="1B2610"/>
+                <w:sz w:val="18"/>
+              </w:rPr>
+              <w:t>Yes</w:t>
             </w:r>
           </w:p>
         </w:tc>
@@ -1807,79 +1732,13 @@
                 <w:color w:val="1B2610"/>
                 <w:sz w:val="18"/>
               </w:rPr>
-              <w:t>200</w:t>
-            </w:r>
-          </w:p>
-        </w:tc>
-        <w:tc>
-          <w:tcPr>
-            <w:tcW w:type="dxa" w:w="1247"/>
-          </w:tcPr>
-          <w:p>
-            <w:pPr>
-              <w:keepNext/>
-              <w:spacing w:after="0"/>
-              <w:jc w:val="center"/>
-            </w:pPr>
-            <w:r>
-              <w:rPr>
-                <w:rFonts w:ascii="Arial" w:hAnsi="Arial"/>
-                <w:b w:val="0"/>
-                <w:i w:val="0"/>
-                <w:color w:val="1B2610"/>
-                <w:sz w:val="18"/>
-              </w:rPr>
               <w:t>Yes</w:t>
             </w:r>
           </w:p>
         </w:tc>
         <w:tc>
           <w:tcPr>
-            <w:tcW w:type="dxa" w:w="907"/>
-          </w:tcPr>
-          <w:p>
-            <w:pPr>
-              <w:keepNext/>
-              <w:spacing w:after="0"/>
-              <w:jc w:val="center"/>
-            </w:pPr>
-            <w:r>
-              <w:rPr>
-                <w:rFonts w:ascii="Arial" w:hAnsi="Arial"/>
-                <w:b w:val="0"/>
-                <w:i w:val="0"/>
-                <w:color w:val="1B2610"/>
-                <w:sz w:val="18"/>
-              </w:rPr>
-              <w:t>No</w:t>
-            </w:r>
-          </w:p>
-        </w:tc>
-        <w:tc>
-          <w:tcPr>
-            <w:tcW w:type="dxa" w:w="1020"/>
-          </w:tcPr>
-          <w:p>
-            <w:pPr>
-              <w:keepNext/>
-              <w:spacing w:after="0"/>
-              <w:jc w:val="center"/>
-            </w:pPr>
-            <w:r>
-              <w:rPr>
-                <w:rFonts w:ascii="Arial" w:hAnsi="Arial"/>
-                <w:b w:val="0"/>
-                <w:i w:val="0"/>
-                <w:color w:val="1B2610"/>
-                <w:sz w:val="18"/>
-              </w:rPr>
-              <w:t>Yes</w:t>
-            </w:r>
-          </w:p>
-        </w:tc>
-        <w:tc>
-          <w:tcPr>
-            <w:tcW w:type="dxa" w:w="794"/>
+            <w:tcW w:type="dxa" w:w="964"/>
           </w:tcPr>
           <w:p>
             <w:pPr>
@@ -1928,7 +1787,7 @@
         </w:tc>
         <w:tc>
           <w:tcPr>
-            <w:tcW w:type="dxa" w:w="1814"/>
+            <w:tcW w:type="dxa" w:w="2041"/>
             <w:tcBorders>
               <w:top w:val="single" w:sz="8" w:space="0" w:color="55891A"/>
             </w:tcBorders>
@@ -1951,7 +1810,7 @@
         </w:tc>
         <w:tc>
           <w:tcPr>
-            <w:tcW w:type="dxa" w:w="1587"/>
+            <w:tcW w:type="dxa" w:w="1701"/>
             <w:tcBorders>
               <w:top w:val="single" w:sz="8" w:space="0" w:color="55891A"/>
             </w:tcBorders>
@@ -1968,6 +1827,54 @@
                 <w:color w:val="1B2610"/>
                 <w:sz w:val="18"/>
               </w:rPr>
+            </w:r>
+          </w:p>
+        </w:tc>
+        <w:tc>
+          <w:tcPr>
+            <w:tcW w:type="dxa" w:w="1247"/>
+            <w:tcBorders>
+              <w:top w:val="single" w:sz="8" w:space="0" w:color="55891A"/>
+            </w:tcBorders>
+          </w:tcPr>
+          <w:p>
+            <w:pPr>
+              <w:spacing w:after="0"/>
+              <w:jc w:val="center"/>
+            </w:pPr>
+            <w:r>
+              <w:rPr>
+                <w:rFonts w:ascii="Arial" w:hAnsi="Arial"/>
+                <w:b/>
+                <w:i w:val="0"/>
+                <w:color w:val="1B2610"/>
+                <w:sz w:val="18"/>
+              </w:rPr>
+              <w:t>200</w:t>
+            </w:r>
+          </w:p>
+        </w:tc>
+        <w:tc>
+          <w:tcPr>
+            <w:tcW w:type="dxa" w:w="1474"/>
+            <w:tcBorders>
+              <w:top w:val="single" w:sz="8" w:space="0" w:color="55891A"/>
+            </w:tcBorders>
+          </w:tcPr>
+          <w:p>
+            <w:pPr>
+              <w:spacing w:after="0"/>
+              <w:jc w:val="center"/>
+            </w:pPr>
+            <w:r>
+              <w:rPr>
+                <w:rFonts w:ascii="Arial" w:hAnsi="Arial"/>
+                <w:b/>
+                <w:i w:val="0"/>
+                <w:color w:val="1B2610"/>
+                <w:sz w:val="18"/>
+              </w:rPr>
+              <w:t>1</w:t>
             </w:r>
           </w:p>
         </w:tc>
@@ -1991,85 +1898,13 @@
                 <w:color w:val="1B2610"/>
                 <w:sz w:val="18"/>
               </w:rPr>
-              <w:t>200</w:t>
-            </w:r>
-          </w:p>
-        </w:tc>
-        <w:tc>
-          <w:tcPr>
-            <w:tcW w:type="dxa" w:w="1247"/>
-            <w:tcBorders>
-              <w:top w:val="single" w:sz="8" w:space="0" w:color="55891A"/>
-            </w:tcBorders>
-          </w:tcPr>
-          <w:p>
-            <w:pPr>
-              <w:spacing w:after="0"/>
-              <w:jc w:val="center"/>
-            </w:pPr>
-            <w:r>
-              <w:rPr>
-                <w:rFonts w:ascii="Arial" w:hAnsi="Arial"/>
-                <w:b/>
-                <w:i w:val="0"/>
-                <w:color w:val="1B2610"/>
-                <w:sz w:val="18"/>
-              </w:rPr>
               <w:t>1</w:t>
             </w:r>
           </w:p>
         </w:tc>
         <w:tc>
           <w:tcPr>
-            <w:tcW w:type="dxa" w:w="907"/>
-            <w:tcBorders>
-              <w:top w:val="single" w:sz="8" w:space="0" w:color="55891A"/>
-            </w:tcBorders>
-          </w:tcPr>
-          <w:p>
-            <w:pPr>
-              <w:spacing w:after="0"/>
-              <w:jc w:val="center"/>
-            </w:pPr>
-            <w:r>
-              <w:rPr>
-                <w:rFonts w:ascii="Arial" w:hAnsi="Arial"/>
-                <w:b/>
-                <w:i w:val="0"/>
-                <w:color w:val="1B2610"/>
-                <w:sz w:val="18"/>
-              </w:rPr>
-              <w:t>0</w:t>
-            </w:r>
-          </w:p>
-        </w:tc>
-        <w:tc>
-          <w:tcPr>
-            <w:tcW w:type="dxa" w:w="1020"/>
-            <w:tcBorders>
-              <w:top w:val="single" w:sz="8" w:space="0" w:color="55891A"/>
-            </w:tcBorders>
-          </w:tcPr>
-          <w:p>
-            <w:pPr>
-              <w:spacing w:after="0"/>
-              <w:jc w:val="center"/>
-            </w:pPr>
-            <w:r>
-              <w:rPr>
-                <w:rFonts w:ascii="Arial" w:hAnsi="Arial"/>
-                <w:b/>
-                <w:i w:val="0"/>
-                <w:color w:val="1B2610"/>
-                <w:sz w:val="18"/>
-              </w:rPr>
-              <w:t>1</w:t>
-            </w:r>
-          </w:p>
-        </w:tc>
-        <w:tc>
-          <w:tcPr>
-            <w:tcW w:type="dxa" w:w="794"/>
+            <w:tcW w:type="dxa" w:w="964"/>
             <w:tcBorders>
               <w:top w:val="single" w:sz="8" w:space="0" w:color="55891A"/>
             </w:tcBorders>
@@ -2156,27 +1991,7 @@
         <w:pStyle w:val="Heading2"/>
       </w:pPr>
       <w:r>
-        <w:t>5.2 Catering</w:t>
-      </w:r>
-    </w:p>
-    <w:p>
-      <w:r>
-        <w:rPr>
-          <w:rFonts w:ascii="Arial" w:hAnsi="Arial"/>
-          <w:b w:val="0"/>
-          <w:i w:val="0"/>
-          <w:color w:val="1B2610"/>
-          <w:sz w:val="20"/>
-        </w:rPr>
-        <w:t>Catering was provided in Afgoye and Balcad only, as set out in the contract. No catering was provided in Banadir (Mogadishu).</w:t>
-      </w:r>
-    </w:p>
-    <w:p>
-      <w:pPr>
-        <w:pStyle w:val="Heading2"/>
-      </w:pPr>
-      <w:r>
-        <w:t>5.3 Ceremony steps</w:t>
+        <w:t>5.2 Ceremony steps</w:t>
       </w:r>
     </w:p>
     <w:p>
@@ -2334,7 +2149,7 @@
         <w:pStyle w:val="Heading2"/>
       </w:pPr>
       <w:r>
-        <w:t>5.4 Coordination with the PIU</w:t>
+        <w:t>5.3 Coordination with the PIU</w:t>
       </w:r>
     </w:p>
     <w:p>
@@ -2366,140 +2181,8 @@
           <w:color w:val="1B2610"/>
           <w:sz w:val="20"/>
         </w:rPr>
-        <w:t>Photo and video coverage was provided at the ceremony in Banadir (Mogadishu). The full media files are available at:</w:t>
+        <w:t>Photo and video coverage was provided at the ceremony in Banadir (Mogadishu). Links and details for each district are in Annex A.</w:t>
       </w:r>
-    </w:p>
-    <w:tbl>
-      <w:tblPr>
-        <w:tblW w:type="auto" w:w="0"/>
-        <w:jc w:val="center"/>
-        <w:tblLayout w:type="fixed"/>
-        <w:tblLook w:firstColumn="1" w:firstRow="1" w:lastColumn="0" w:lastRow="0" w:noHBand="0" w:noVBand="1" w:val="04A0"/>
-        <w:tblBorders>
-          <w:top w:val="single" w:sz="4" w:space="0" w:color="BCC9AD"/>
-          <w:left w:val="nil"/>
-          <w:bottom w:val="single" w:sz="4" w:space="0" w:color="BCC9AD"/>
-          <w:right w:val="nil"/>
-          <w:insideH w:val="single" w:sz="4" w:space="0" w:color="BCC9AD"/>
-          <w:insideV w:val="nil"/>
-        </w:tblBorders>
-        <w:tblCellMar>
-          <w:top w:w="50" w:type="dxa"/>
-          <w:left w:w="80" w:type="dxa"/>
-          <w:bottom w:w="50" w:type="dxa"/>
-          <w:right w:w="80" w:type="dxa"/>
-        </w:tblCellMar>
-        <w:tblLayout w:type="fixed"/>
-      </w:tblPr>
-      <w:tblGrid>
-        <w:gridCol w:w="2268"/>
-        <w:gridCol w:w="6520"/>
-      </w:tblGrid>
-      <w:tr>
-        <w:trPr>
-          <w:cantSplit/>
-          <w:tblHeader/>
-        </w:trPr>
-        <w:tc>
-          <w:tcPr>
-            <w:tcW w:type="dxa" w:w="2268"/>
-            <w:tcBorders>
-              <w:bottom w:val="single" w:sz="12" w:space="0" w:color="55891A"/>
-            </w:tcBorders>
-          </w:tcPr>
-          <w:p>
-            <w:pPr>
-              <w:keepNext/>
-              <w:spacing w:after="0"/>
-            </w:pPr>
-            <w:r>
-              <w:rPr>
-                <w:rFonts w:ascii="Arial" w:hAnsi="Arial"/>
-                <w:b/>
-                <w:i w:val="0"/>
-                <w:color w:val="55891A"/>
-                <w:sz w:val="17"/>
-              </w:rPr>
-              <w:t>District</w:t>
-            </w:r>
-          </w:p>
-        </w:tc>
-        <w:tc>
-          <w:tcPr>
-            <w:tcW w:type="dxa" w:w="6520"/>
-            <w:tcBorders>
-              <w:bottom w:val="single" w:sz="12" w:space="0" w:color="55891A"/>
-            </w:tcBorders>
-          </w:tcPr>
-          <w:p>
-            <w:pPr>
-              <w:keepNext/>
-              <w:spacing w:after="0"/>
-            </w:pPr>
-            <w:r>
-              <w:rPr>
-                <w:rFonts w:ascii="Arial" w:hAnsi="Arial"/>
-                <w:b/>
-                <w:i w:val="0"/>
-                <w:color w:val="55891A"/>
-                <w:sz w:val="17"/>
-              </w:rPr>
-              <w:t>Media link / folder (photos and videos)</w:t>
-            </w:r>
-          </w:p>
-        </w:tc>
-      </w:tr>
-      <w:tr>
-        <w:trPr>
-          <w:cantSplit/>
-        </w:trPr>
-        <w:tc>
-          <w:tcPr>
-            <w:tcW w:type="dxa" w:w="2268"/>
-          </w:tcPr>
-          <w:p>
-            <w:pPr>
-              <w:spacing w:after="0"/>
-            </w:pPr>
-            <w:r>
-              <w:rPr>
-                <w:rFonts w:ascii="Arial" w:hAnsi="Arial"/>
-                <w:b w:val="0"/>
-                <w:i w:val="0"/>
-                <w:color w:val="1B2610"/>
-                <w:sz w:val="18"/>
-              </w:rPr>
-              <w:t>Mogadishu</w:t>
-            </w:r>
-          </w:p>
-        </w:tc>
-        <w:tc>
-          <w:tcPr>
-            <w:tcW w:type="dxa" w:w="6520"/>
-          </w:tcPr>
-          <w:p>
-            <w:pPr>
-              <w:spacing w:after="0"/>
-            </w:pPr>
-            <w:hyperlink r:id="rId13">
-              <w:r>
-                <w:rPr>
-                  <w:rFonts w:ascii="Arial" w:hAnsi="Arial" w:cs="Arial"/>
-                  <w:color w:val="55891A"/>
-                  <w:sz w:val="17"/>
-                  <w:u w:val="single"/>
-                </w:rPr>
-                <w:t>https://www.facebook.com/reel/916665714471740</w:t>
-              </w:r>
-            </w:hyperlink>
-          </w:p>
-        </w:tc>
-      </w:tr>
-    </w:tbl>
-    <w:p>
-      <w:pPr>
-        <w:spacing w:after="40"/>
-      </w:pPr>
     </w:p>
     <w:p>
       <w:pPr>
@@ -3006,7 +2689,7 @@
                           <pic:cNvPicPr/>
                         </pic:nvPicPr>
                         <pic:blipFill>
-                          <a:blip r:embed="rId14"/>
+                          <a:blip r:embed="rId13"/>
                           <a:stretch>
                             <a:fillRect/>
                           </a:stretch>
@@ -3050,7 +2733,7 @@
                           <pic:cNvPicPr/>
                         </pic:nvPicPr>
                         <pic:blipFill>
-                          <a:blip r:embed="rId15"/>
+                          <a:blip r:embed="rId14"/>
                           <a:stretch>
                             <a:fillRect/>
                           </a:stretch>
@@ -3146,6 +2829,342 @@
         </w:tc>
       </w:tr>
     </w:tbl>
+    <w:p>
+      <w:r>
+        <w:br w:type="page"/>
+      </w:r>
+    </w:p>
+    <w:p>
+      <w:pPr>
+        <w:pStyle w:val="Heading1"/>
+      </w:pPr>
+      <w:r>
+        <w:t>Annex A: Media Coverage — Links and Details</w:t>
+      </w:r>
+    </w:p>
+    <w:p>
+      <w:r>
+        <w:rPr>
+          <w:rFonts w:ascii="Arial" w:hAnsi="Arial"/>
+          <w:b w:val="0"/>
+          <w:i w:val="0"/>
+          <w:color w:val="1B2610"/>
+          <w:sz w:val="20"/>
+        </w:rPr>
+        <w:t>Photo and video coverage was provided at the ceremony in Banadir (Mogadishu). The details and links for each district are below.</w:t>
+      </w:r>
+    </w:p>
+    <w:p>
+      <w:pPr>
+        <w:pStyle w:val="Heading2"/>
+      </w:pPr>
+      <w:r>
+        <w:t>A.1  Mogadishu</w:t>
+      </w:r>
+    </w:p>
+    <w:tbl>
+      <w:tblPr>
+        <w:tblW w:type="auto" w:w="0"/>
+        <w:jc w:val="center"/>
+        <w:tblLayout w:type="fixed"/>
+        <w:tblLook w:firstColumn="1" w:firstRow="1" w:lastColumn="0" w:lastRow="0" w:noHBand="0" w:noVBand="1" w:val="04A0"/>
+        <w:tblBorders>
+          <w:top w:val="single" w:sz="4" w:space="0" w:color="BCC9AD"/>
+          <w:left w:val="nil"/>
+          <w:bottom w:val="single" w:sz="4" w:space="0" w:color="BCC9AD"/>
+          <w:right w:val="nil"/>
+          <w:insideH w:val="single" w:sz="4" w:space="0" w:color="BCC9AD"/>
+          <w:insideV w:val="nil"/>
+        </w:tblBorders>
+        <w:tblCellMar>
+          <w:top w:w="50" w:type="dxa"/>
+          <w:left w:w="80" w:type="dxa"/>
+          <w:bottom w:w="50" w:type="dxa"/>
+          <w:right w:w="80" w:type="dxa"/>
+        </w:tblCellMar>
+        <w:tblLayout w:type="fixed"/>
+      </w:tblPr>
+      <w:tblGrid>
+        <w:gridCol w:w="2551"/>
+        <w:gridCol w:w="6237"/>
+      </w:tblGrid>
+      <w:tr>
+        <w:trPr>
+          <w:cantSplit/>
+        </w:trPr>
+        <w:tc>
+          <w:tcPr>
+            <w:tcW w:type="dxa" w:w="2551"/>
+          </w:tcPr>
+          <w:p>
+            <w:pPr>
+              <w:spacing w:after="0"/>
+            </w:pPr>
+            <w:r>
+              <w:rPr>
+                <w:rFonts w:ascii="Arial" w:hAnsi="Arial"/>
+                <w:b/>
+                <w:i w:val="0"/>
+                <w:color w:val="FD6902"/>
+                <w:sz w:val="19"/>
+              </w:rPr>
+              <w:t>District</w:t>
+            </w:r>
+          </w:p>
+        </w:tc>
+        <w:tc>
+          <w:tcPr>
+            <w:tcW w:type="dxa" w:w="6236"/>
+          </w:tcPr>
+          <w:p>
+            <w:pPr>
+              <w:spacing w:after="0"/>
+            </w:pPr>
+            <w:r>
+              <w:rPr>
+                <w:rFonts w:ascii="Arial" w:hAnsi="Arial"/>
+                <w:b w:val="0"/>
+                <w:i w:val="0"/>
+                <w:color w:val="1B2610"/>
+                <w:sz w:val="19"/>
+              </w:rPr>
+              <w:t>Mogadishu</w:t>
+            </w:r>
+          </w:p>
+        </w:tc>
+      </w:tr>
+      <w:tr>
+        <w:trPr>
+          <w:cantSplit/>
+        </w:trPr>
+        <w:tc>
+          <w:tcPr>
+            <w:tcW w:type="dxa" w:w="2551"/>
+          </w:tcPr>
+          <w:p>
+            <w:pPr>
+              <w:spacing w:after="0"/>
+            </w:pPr>
+            <w:r>
+              <w:rPr>
+                <w:rFonts w:ascii="Arial" w:hAnsi="Arial"/>
+                <w:b/>
+                <w:i w:val="0"/>
+                <w:color w:val="FD6902"/>
+                <w:sz w:val="19"/>
+              </w:rPr>
+              <w:t>Region</w:t>
+            </w:r>
+          </w:p>
+        </w:tc>
+        <w:tc>
+          <w:tcPr>
+            <w:tcW w:type="dxa" w:w="6236"/>
+          </w:tcPr>
+          <w:p>
+            <w:pPr>
+              <w:spacing w:after="0"/>
+            </w:pPr>
+            <w:r>
+              <w:rPr>
+                <w:rFonts w:ascii="Arial" w:hAnsi="Arial"/>
+                <w:b w:val="0"/>
+                <w:i w:val="0"/>
+                <w:color w:val="1B2610"/>
+                <w:sz w:val="19"/>
+              </w:rPr>
+              <w:t>Banadir (Mogadishu)</w:t>
+            </w:r>
+          </w:p>
+        </w:tc>
+      </w:tr>
+      <w:tr>
+        <w:trPr>
+          <w:cantSplit/>
+        </w:trPr>
+        <w:tc>
+          <w:tcPr>
+            <w:tcW w:type="dxa" w:w="2551"/>
+          </w:tcPr>
+          <w:p>
+            <w:pPr>
+              <w:spacing w:after="0"/>
+            </w:pPr>
+            <w:r>
+              <w:rPr>
+                <w:rFonts w:ascii="Arial" w:hAnsi="Arial"/>
+                <w:b/>
+                <w:i w:val="0"/>
+                <w:color w:val="FD6902"/>
+                <w:sz w:val="19"/>
+              </w:rPr>
+              <w:t>Ceremony date</w:t>
+            </w:r>
+          </w:p>
+        </w:tc>
+        <w:tc>
+          <w:tcPr>
+            <w:tcW w:type="dxa" w:w="6236"/>
+          </w:tcPr>
+          <w:p>
+            <w:pPr>
+              <w:spacing w:after="0"/>
+            </w:pPr>
+            <w:r>
+              <w:rPr>
+                <w:rFonts w:ascii="Arial" w:hAnsi="Arial"/>
+                <w:b w:val="0"/>
+                <w:i w:val="0"/>
+                <w:color w:val="1B2610"/>
+                <w:sz w:val="19"/>
+              </w:rPr>
+              <w:t>6 September 2026</w:t>
+            </w:r>
+          </w:p>
+        </w:tc>
+      </w:tr>
+      <w:tr>
+        <w:trPr>
+          <w:cantSplit/>
+        </w:trPr>
+        <w:tc>
+          <w:tcPr>
+            <w:tcW w:type="dxa" w:w="2551"/>
+          </w:tcPr>
+          <w:p>
+            <w:pPr>
+              <w:spacing w:after="0"/>
+            </w:pPr>
+            <w:r>
+              <w:rPr>
+                <w:rFonts w:ascii="Arial" w:hAnsi="Arial"/>
+                <w:b/>
+                <w:i w:val="0"/>
+                <w:color w:val="FD6902"/>
+                <w:sz w:val="19"/>
+              </w:rPr>
+              <w:t>Families</w:t>
+            </w:r>
+          </w:p>
+        </w:tc>
+        <w:tc>
+          <w:tcPr>
+            <w:tcW w:type="dxa" w:w="6236"/>
+          </w:tcPr>
+          <w:p>
+            <w:pPr>
+              <w:spacing w:after="0"/>
+            </w:pPr>
+            <w:r>
+              <w:rPr>
+                <w:rFonts w:ascii="Arial" w:hAnsi="Arial"/>
+                <w:b w:val="0"/>
+                <w:i w:val="0"/>
+                <w:color w:val="1B2610"/>
+                <w:sz w:val="19"/>
+              </w:rPr>
+              <w:t>200</w:t>
+            </w:r>
+          </w:p>
+        </w:tc>
+      </w:tr>
+      <w:tr>
+        <w:trPr>
+          <w:cantSplit/>
+        </w:trPr>
+        <w:tc>
+          <w:tcPr>
+            <w:tcW w:type="dxa" w:w="2551"/>
+          </w:tcPr>
+          <w:p>
+            <w:pPr>
+              <w:spacing w:after="0"/>
+            </w:pPr>
+            <w:r>
+              <w:rPr>
+                <w:rFonts w:ascii="Arial" w:hAnsi="Arial"/>
+                <w:b/>
+                <w:i w:val="0"/>
+                <w:color w:val="FD6902"/>
+                <w:sz w:val="19"/>
+              </w:rPr>
+              <w:t>Media provided</w:t>
+            </w:r>
+          </w:p>
+        </w:tc>
+        <w:tc>
+          <w:tcPr>
+            <w:tcW w:type="dxa" w:w="6236"/>
+          </w:tcPr>
+          <w:p>
+            <w:pPr>
+              <w:spacing w:after="0"/>
+            </w:pPr>
+            <w:r>
+              <w:rPr>
+                <w:rFonts w:ascii="Arial" w:hAnsi="Arial"/>
+                <w:b w:val="0"/>
+                <w:i w:val="0"/>
+                <w:color w:val="1B2610"/>
+                <w:sz w:val="19"/>
+              </w:rPr>
+              <w:t>Photography and video coverage of the ceremony</w:t>
+            </w:r>
+          </w:p>
+        </w:tc>
+      </w:tr>
+      <w:tr>
+        <w:trPr>
+          <w:cantSplit/>
+        </w:trPr>
+        <w:tc>
+          <w:tcPr>
+            <w:tcW w:type="dxa" w:w="2551"/>
+          </w:tcPr>
+          <w:p>
+            <w:pPr>
+              <w:spacing w:after="0"/>
+            </w:pPr>
+            <w:r>
+              <w:rPr>
+                <w:rFonts w:ascii="Arial" w:hAnsi="Arial"/>
+                <w:b/>
+                <w:i w:val="0"/>
+                <w:color w:val="FD6902"/>
+                <w:sz w:val="19"/>
+              </w:rPr>
+              <w:t>Photos and videos</w:t>
+            </w:r>
+          </w:p>
+        </w:tc>
+        <w:tc>
+          <w:tcPr>
+            <w:tcW w:type="dxa" w:w="6236"/>
+          </w:tcPr>
+          <w:p>
+            <w:pPr>
+              <w:spacing w:after="0"/>
+            </w:pPr>
+            <w:hyperlink r:id="rId15">
+              <w:r>
+                <w:rPr>
+                  <w:rFonts w:ascii="Arial" w:hAnsi="Arial" w:cs="Arial"/>
+                  <w:color w:val="55891A"/>
+                  <w:sz w:val="17"/>
+                  <w:u w:val="single"/>
+                </w:rPr>
+                <w:t>https://www.facebook.com/reel/916665714471740</w:t>
+              </w:r>
+            </w:hyperlink>
+          </w:p>
+        </w:tc>
+      </w:tr>
+    </w:tbl>
+    <w:p>
+      <w:pPr>
+        <w:spacing w:after="40"/>
+      </w:pPr>
+    </w:p>
     <w:sectPr>
       <w:headerReference w:type="default" r:id="rId9"/>
       <w:footerReference w:type="default" r:id="rId10"/>

</xml_diff>

<commit_message>
State reports: correct ceremony dates per district; annex now lists media house, channel, views, link per city
Dates and media rows taken from the client's edited Media_Links_Details.xlsx.

Co-Authored-By: Claude Sonnet 5.5 <noreply@anthropic.com>
Claude-Session: https://claude.ai/code/session_01B6RPWkBpLKoctTdaNtAabD
</commit_message>
<xml_diff>
--- a/state_reports/Rasmi_Event_Management_Report_HoA_DRIVE_Banadir.docx
+++ b/state_reports/Rasmi_Event_Management_Report_HoA_DRIVE_Banadir.docx
@@ -452,7 +452,7 @@
                 <w:color w:val="FD6902"/>
                 <w:sz w:val="19"/>
               </w:rPr>
-              <w:t>Ceremony date</w:t>
+              <w:t>Ceremony dates</w:t>
             </w:r>
           </w:p>
         </w:tc>
@@ -472,7 +472,7 @@
                 <w:color w:val="1B2610"/>
                 <w:sz w:val="19"/>
               </w:rPr>
-              <w:t>6 September 2026</w:t>
+              <w:t>Mogadishu: 7 Sep 2026</w:t>
             </w:r>
           </w:p>
         </w:tc>
@@ -732,7 +732,7 @@
           <w:color w:val="1B2610"/>
           <w:sz w:val="20"/>
         </w:rPr>
-        <w:t xml:space="preserve"> on 6 September 2026. A total of </w:t>
+        <w:t xml:space="preserve"> (ceremony dates: Mogadishu: 7 Sep 2026). A total of </w:t>
       </w:r>
       <w:r>
         <w:rPr>
@@ -874,7 +874,7 @@
                 <w:color w:val="55891A"/>
                 <w:sz w:val="18"/>
               </w:rPr>
-              <w:t>Date</w:t>
+              <w:t>Dates</w:t>
             </w:r>
           </w:p>
         </w:tc>
@@ -960,7 +960,7 @@
                 <w:color w:val="55891A"/>
                 <w:sz w:val="22"/>
               </w:rPr>
-              <w:t>6 Sep 2026</w:t>
+              <w:t>7 Sep 2026</w:t>
             </w:r>
           </w:p>
         </w:tc>
@@ -1666,7 +1666,7 @@
                 <w:color w:val="1B2610"/>
                 <w:sz w:val="18"/>
               </w:rPr>
-              <w:t>6 Sep 2026</w:t>
+              <w:t>7 Sep 2026</w:t>
             </w:r>
           </w:p>
         </w:tc>
@@ -2839,7 +2839,7 @@
         <w:pStyle w:val="Heading1"/>
       </w:pPr>
       <w:r>
-        <w:t>Annex A: Media Coverage — Links and Details</w:t>
+        <w:t>Annex A: Media Coverage — Banadir (Mogadishu)</w:t>
       </w:r>
     </w:p>
     <w:p>
@@ -2851,15 +2851,7 @@
           <w:color w:val="1B2610"/>
           <w:sz w:val="20"/>
         </w:rPr>
-        <w:t>Photo and video coverage was provided at the ceremony in Banadir (Mogadishu). The details and links for each district are below.</w:t>
-      </w:r>
-    </w:p>
-    <w:p>
-      <w:pPr>
-        <w:pStyle w:val="Heading2"/>
-      </w:pPr>
-      <w:r>
-        <w:t>A.1  Mogadishu</w:t>
+        <w:t>Photo and video coverage of the ceremonies in Banadir (Mogadishu), by media house, with the city, the channel, the views and the link to each post. Views were checked on 14 October 2026 and will change.</w:t>
       </w:r>
     </w:p>
     <w:tbl>
@@ -2885,19 +2877,28 @@
         <w:tblLayout w:type="fixed"/>
       </w:tblPr>
       <w:tblGrid>
-        <w:gridCol w:w="2551"/>
-        <w:gridCol w:w="6237"/>
+        <w:gridCol w:w="396"/>
+        <w:gridCol w:w="1530"/>
+        <w:gridCol w:w="2438"/>
+        <w:gridCol w:w="1020"/>
+        <w:gridCol w:w="793"/>
+        <w:gridCol w:w="2664"/>
       </w:tblGrid>
       <w:tr>
         <w:trPr>
           <w:cantSplit/>
+          <w:tblHeader/>
         </w:trPr>
         <w:tc>
           <w:tcPr>
-            <w:tcW w:type="dxa" w:w="2551"/>
+            <w:tcW w:type="dxa" w:w="397"/>
+            <w:tcBorders>
+              <w:bottom w:val="single" w:sz="12" w:space="0" w:color="55891A"/>
+            </w:tcBorders>
           </w:tcPr>
           <w:p>
             <w:pPr>
+              <w:keepNext/>
               <w:spacing w:after="0"/>
             </w:pPr>
             <w:r>
@@ -2905,16 +2906,408 @@
                 <w:rFonts w:ascii="Arial" w:hAnsi="Arial"/>
                 <w:b/>
                 <w:i w:val="0"/>
-                <w:color w:val="FD6902"/>
-                <w:sz w:val="19"/>
+                <w:color w:val="55891A"/>
+                <w:sz w:val="17"/>
               </w:rPr>
-              <w:t>District</w:t>
+              <w:t>#</w:t>
             </w:r>
           </w:p>
         </w:tc>
         <w:tc>
           <w:tcPr>
-            <w:tcW w:type="dxa" w:w="6236"/>
+            <w:tcW w:type="dxa" w:w="1531"/>
+            <w:tcBorders>
+              <w:bottom w:val="single" w:sz="12" w:space="0" w:color="55891A"/>
+            </w:tcBorders>
+          </w:tcPr>
+          <w:p>
+            <w:pPr>
+              <w:keepNext/>
+              <w:spacing w:after="0"/>
+            </w:pPr>
+            <w:r>
+              <w:rPr>
+                <w:rFonts w:ascii="Arial" w:hAnsi="Arial"/>
+                <w:b/>
+                <w:i w:val="0"/>
+                <w:color w:val="55891A"/>
+                <w:sz w:val="17"/>
+              </w:rPr>
+              <w:t>City</w:t>
+            </w:r>
+          </w:p>
+        </w:tc>
+        <w:tc>
+          <w:tcPr>
+            <w:tcW w:type="dxa" w:w="2438"/>
+            <w:tcBorders>
+              <w:bottom w:val="single" w:sz="12" w:space="0" w:color="55891A"/>
+            </w:tcBorders>
+          </w:tcPr>
+          <w:p>
+            <w:pPr>
+              <w:keepNext/>
+              <w:spacing w:after="0"/>
+            </w:pPr>
+            <w:r>
+              <w:rPr>
+                <w:rFonts w:ascii="Arial" w:hAnsi="Arial"/>
+                <w:b/>
+                <w:i w:val="0"/>
+                <w:color w:val="55891A"/>
+                <w:sz w:val="17"/>
+              </w:rPr>
+              <w:t>Media house / outlet</w:t>
+            </w:r>
+          </w:p>
+        </w:tc>
+        <w:tc>
+          <w:tcPr>
+            <w:tcW w:type="dxa" w:w="1020"/>
+            <w:tcBorders>
+              <w:bottom w:val="single" w:sz="12" w:space="0" w:color="55891A"/>
+            </w:tcBorders>
+          </w:tcPr>
+          <w:p>
+            <w:pPr>
+              <w:keepNext/>
+              <w:spacing w:after="0"/>
+            </w:pPr>
+            <w:r>
+              <w:rPr>
+                <w:rFonts w:ascii="Arial" w:hAnsi="Arial"/>
+                <w:b/>
+                <w:i w:val="0"/>
+                <w:color w:val="55891A"/>
+                <w:sz w:val="17"/>
+              </w:rPr>
+              <w:t>Channel</w:t>
+            </w:r>
+          </w:p>
+        </w:tc>
+        <w:tc>
+          <w:tcPr>
+            <w:tcW w:type="dxa" w:w="794"/>
+            <w:tcBorders>
+              <w:bottom w:val="single" w:sz="12" w:space="0" w:color="55891A"/>
+            </w:tcBorders>
+          </w:tcPr>
+          <w:p>
+            <w:pPr>
+              <w:keepNext/>
+              <w:spacing w:after="0"/>
+              <w:jc w:val="center"/>
+            </w:pPr>
+            <w:r>
+              <w:rPr>
+                <w:rFonts w:ascii="Arial" w:hAnsi="Arial"/>
+                <w:b/>
+                <w:i w:val="0"/>
+                <w:color w:val="55891A"/>
+                <w:sz w:val="17"/>
+              </w:rPr>
+              <w:t>Views</w:t>
+            </w:r>
+          </w:p>
+        </w:tc>
+        <w:tc>
+          <w:tcPr>
+            <w:tcW w:type="dxa" w:w="2665"/>
+            <w:tcBorders>
+              <w:bottom w:val="single" w:sz="12" w:space="0" w:color="55891A"/>
+            </w:tcBorders>
+          </w:tcPr>
+          <w:p>
+            <w:pPr>
+              <w:keepNext/>
+              <w:spacing w:after="0"/>
+            </w:pPr>
+            <w:r>
+              <w:rPr>
+                <w:rFonts w:ascii="Arial" w:hAnsi="Arial"/>
+                <w:b/>
+                <w:i w:val="0"/>
+                <w:color w:val="55891A"/>
+                <w:sz w:val="17"/>
+              </w:rPr>
+              <w:t>Link</w:t>
+            </w:r>
+          </w:p>
+        </w:tc>
+      </w:tr>
+      <w:tr>
+        <w:trPr>
+          <w:cantSplit/>
+        </w:trPr>
+        <w:tc>
+          <w:tcPr>
+            <w:tcW w:type="dxa" w:w="397"/>
+          </w:tcPr>
+          <w:p>
+            <w:pPr>
+              <w:keepNext/>
+              <w:spacing w:after="0"/>
+            </w:pPr>
+            <w:r>
+              <w:rPr>
+                <w:rFonts w:ascii="Arial" w:hAnsi="Arial"/>
+                <w:b w:val="0"/>
+                <w:i w:val="0"/>
+                <w:color w:val="1B2610"/>
+                <w:sz w:val="18"/>
+              </w:rPr>
+              <w:t>1</w:t>
+            </w:r>
+          </w:p>
+        </w:tc>
+        <w:tc>
+          <w:tcPr>
+            <w:tcW w:type="dxa" w:w="1531"/>
+          </w:tcPr>
+          <w:p>
+            <w:pPr>
+              <w:keepNext/>
+              <w:spacing w:after="0"/>
+            </w:pPr>
+            <w:r>
+              <w:rPr>
+                <w:rFonts w:ascii="Arial" w:hAnsi="Arial"/>
+                <w:b w:val="0"/>
+                <w:i w:val="0"/>
+                <w:color w:val="1B2610"/>
+                <w:sz w:val="18"/>
+              </w:rPr>
+              <w:t>Mogadishu</w:t>
+            </w:r>
+          </w:p>
+        </w:tc>
+        <w:tc>
+          <w:tcPr>
+            <w:tcW w:type="dxa" w:w="2438"/>
+          </w:tcPr>
+          <w:p>
+            <w:pPr>
+              <w:keepNext/>
+              <w:spacing w:after="0"/>
+            </w:pPr>
+            <w:r>
+              <w:rPr>
+                <w:rFonts w:ascii="Arial" w:hAnsi="Arial"/>
+                <w:b w:val="0"/>
+                <w:i w:val="0"/>
+                <w:color w:val="1B2610"/>
+                <w:sz w:val="18"/>
+              </w:rPr>
+              <w:t>Telefishinka Qaranka Soomaaliyeed (SNTV)</w:t>
+            </w:r>
+          </w:p>
+        </w:tc>
+        <w:tc>
+          <w:tcPr>
+            <w:tcW w:type="dxa" w:w="1020"/>
+          </w:tcPr>
+          <w:p>
+            <w:pPr>
+              <w:keepNext/>
+              <w:spacing w:after="0"/>
+            </w:pPr>
+            <w:r>
+              <w:rPr>
+                <w:rFonts w:ascii="Arial" w:hAnsi="Arial"/>
+                <w:b w:val="0"/>
+                <w:i w:val="0"/>
+                <w:color w:val="1B2610"/>
+                <w:sz w:val="18"/>
+              </w:rPr>
+              <w:t>Facebook</w:t>
+            </w:r>
+          </w:p>
+        </w:tc>
+        <w:tc>
+          <w:tcPr>
+            <w:tcW w:type="dxa" w:w="794"/>
+          </w:tcPr>
+          <w:p>
+            <w:pPr>
+              <w:keepNext/>
+              <w:spacing w:after="0"/>
+              <w:jc w:val="center"/>
+            </w:pPr>
+            <w:r>
+              <w:rPr>
+                <w:rFonts w:ascii="Arial" w:hAnsi="Arial"/>
+                <w:b w:val="0"/>
+                <w:i w:val="0"/>
+                <w:color w:val="1B2610"/>
+                <w:sz w:val="18"/>
+              </w:rPr>
+              <w:t>37K</w:t>
+            </w:r>
+          </w:p>
+        </w:tc>
+        <w:tc>
+          <w:tcPr>
+            <w:tcW w:type="dxa" w:w="2665"/>
+          </w:tcPr>
+          <w:p>
+            <w:pPr>
+              <w:keepNext/>
+              <w:spacing w:after="0"/>
+            </w:pPr>
+            <w:hyperlink r:id="rId15">
+              <w:r>
+                <w:rPr>
+                  <w:rFonts w:ascii="Arial" w:hAnsi="Arial" w:cs="Arial"/>
+                  <w:color w:val="55891A"/>
+                  <w:sz w:val="17"/>
+                  <w:u w:val="single"/>
+                </w:rPr>
+                <w:t>facebook.com/reel/916665714471740</w:t>
+              </w:r>
+            </w:hyperlink>
+          </w:p>
+        </w:tc>
+      </w:tr>
+      <w:tr>
+        <w:trPr>
+          <w:cantSplit/>
+        </w:trPr>
+        <w:tc>
+          <w:tcPr>
+            <w:tcW w:type="dxa" w:w="397"/>
+          </w:tcPr>
+          <w:p>
+            <w:pPr>
+              <w:keepNext/>
+              <w:spacing w:after="0"/>
+            </w:pPr>
+            <w:r>
+              <w:rPr>
+                <w:rFonts w:ascii="Arial" w:hAnsi="Arial"/>
+                <w:b w:val="0"/>
+                <w:i w:val="0"/>
+                <w:color w:val="1B2610"/>
+                <w:sz w:val="18"/>
+              </w:rPr>
+              <w:t>2</w:t>
+            </w:r>
+          </w:p>
+        </w:tc>
+        <w:tc>
+          <w:tcPr>
+            <w:tcW w:type="dxa" w:w="1531"/>
+          </w:tcPr>
+          <w:p>
+            <w:pPr>
+              <w:keepNext/>
+              <w:spacing w:after="0"/>
+            </w:pPr>
+            <w:r>
+              <w:rPr>
+                <w:rFonts w:ascii="Arial" w:hAnsi="Arial"/>
+                <w:b w:val="0"/>
+                <w:i w:val="0"/>
+                <w:color w:val="1B2610"/>
+                <w:sz w:val="18"/>
+              </w:rPr>
+              <w:t>Mogadishu</w:t>
+            </w:r>
+          </w:p>
+        </w:tc>
+        <w:tc>
+          <w:tcPr>
+            <w:tcW w:type="dxa" w:w="2438"/>
+          </w:tcPr>
+          <w:p>
+            <w:pPr>
+              <w:keepNext/>
+              <w:spacing w:after="0"/>
+            </w:pPr>
+            <w:r>
+              <w:rPr>
+                <w:rFonts w:ascii="Arial" w:hAnsi="Arial"/>
+                <w:b w:val="0"/>
+                <w:i w:val="0"/>
+                <w:color w:val="1B2610"/>
+                <w:sz w:val="18"/>
+              </w:rPr>
+              <w:t>Somali National Television (SNTV)</w:t>
+            </w:r>
+          </w:p>
+        </w:tc>
+        <w:tc>
+          <w:tcPr>
+            <w:tcW w:type="dxa" w:w="1020"/>
+          </w:tcPr>
+          <w:p>
+            <w:pPr>
+              <w:keepNext/>
+              <w:spacing w:after="0"/>
+            </w:pPr>
+            <w:r>
+              <w:rPr>
+                <w:rFonts w:ascii="Arial" w:hAnsi="Arial"/>
+                <w:b w:val="0"/>
+                <w:i w:val="0"/>
+                <w:color w:val="1B2610"/>
+                <w:sz w:val="18"/>
+              </w:rPr>
+              <w:t>YouTube</w:t>
+            </w:r>
+          </w:p>
+        </w:tc>
+        <w:tc>
+          <w:tcPr>
+            <w:tcW w:type="dxa" w:w="794"/>
+          </w:tcPr>
+          <w:p>
+            <w:pPr>
+              <w:keepNext/>
+              <w:spacing w:after="0"/>
+              <w:jc w:val="center"/>
+            </w:pPr>
+            <w:r>
+              <w:rPr>
+                <w:rFonts w:ascii="Arial" w:hAnsi="Arial"/>
+                <w:b w:val="0"/>
+                <w:i w:val="0"/>
+                <w:color w:val="1B2610"/>
+                <w:sz w:val="18"/>
+              </w:rPr>
+              <w:t>—</w:t>
+            </w:r>
+          </w:p>
+        </w:tc>
+        <w:tc>
+          <w:tcPr>
+            <w:tcW w:type="dxa" w:w="2665"/>
+          </w:tcPr>
+          <w:p>
+            <w:pPr>
+              <w:keepNext/>
+              <w:spacing w:after="0"/>
+            </w:pPr>
+            <w:hyperlink r:id="rId16">
+              <w:r>
+                <w:rPr>
+                  <w:rFonts w:ascii="Arial" w:hAnsi="Arial" w:cs="Arial"/>
+                  <w:color w:val="55891A"/>
+                  <w:sz w:val="17"/>
+                  <w:u w:val="single"/>
+                </w:rPr>
+                <w:t>youtu.be/r6KLf6HcRBw?si=y_cvvihn6hT…</w:t>
+              </w:r>
+            </w:hyperlink>
+          </w:p>
+        </w:tc>
+      </w:tr>
+      <w:tr>
+        <w:trPr>
+          <w:cantSplit/>
+        </w:trPr>
+        <w:tc>
+          <w:tcPr>
+            <w:tcW w:type="dxa" w:w="397"/>
           </w:tcPr>
           <w:p>
             <w:pPr>
@@ -2926,40 +3319,15 @@
                 <w:b w:val="0"/>
                 <w:i w:val="0"/>
                 <w:color w:val="1B2610"/>
-                <w:sz w:val="19"/>
+                <w:sz w:val="18"/>
               </w:rPr>
-              <w:t>Mogadishu</w:t>
-            </w:r>
-          </w:p>
-        </w:tc>
-      </w:tr>
-      <w:tr>
-        <w:trPr>
-          <w:cantSplit/>
-        </w:trPr>
-        <w:tc>
-          <w:tcPr>
-            <w:tcW w:type="dxa" w:w="2551"/>
-          </w:tcPr>
-          <w:p>
-            <w:pPr>
-              <w:spacing w:after="0"/>
-            </w:pPr>
-            <w:r>
-              <w:rPr>
-                <w:rFonts w:ascii="Arial" w:hAnsi="Arial"/>
-                <w:b/>
-                <w:i w:val="0"/>
-                <w:color w:val="FD6902"/>
-                <w:sz w:val="19"/>
-              </w:rPr>
-              <w:t>Region</w:t>
+              <w:t>3</w:t>
             </w:r>
           </w:p>
         </w:tc>
         <w:tc>
           <w:tcPr>
-            <w:tcW w:type="dxa" w:w="6236"/>
+            <w:tcW w:type="dxa" w:w="1531"/>
           </w:tcPr>
           <w:p>
             <w:pPr>
@@ -2971,40 +3339,15 @@
                 <w:b w:val="0"/>
                 <w:i w:val="0"/>
                 <w:color w:val="1B2610"/>
-                <w:sz w:val="19"/>
+                <w:sz w:val="18"/>
               </w:rPr>
-              <w:t>Banadir (Mogadishu)</w:t>
-            </w:r>
-          </w:p>
-        </w:tc>
-      </w:tr>
-      <w:tr>
-        <w:trPr>
-          <w:cantSplit/>
-        </w:trPr>
-        <w:tc>
-          <w:tcPr>
-            <w:tcW w:type="dxa" w:w="2551"/>
-          </w:tcPr>
-          <w:p>
-            <w:pPr>
-              <w:spacing w:after="0"/>
-            </w:pPr>
-            <w:r>
-              <w:rPr>
-                <w:rFonts w:ascii="Arial" w:hAnsi="Arial"/>
-                <w:b/>
-                <w:i w:val="0"/>
-                <w:color w:val="FD6902"/>
-                <w:sz w:val="19"/>
-              </w:rPr>
-              <w:t>Ceremony date</w:t>
+              <w:t>Mogadishu</w:t>
             </w:r>
           </w:p>
         </w:tc>
         <w:tc>
           <w:tcPr>
-            <w:tcW w:type="dxa" w:w="6236"/>
+            <w:tcW w:type="dxa" w:w="2438"/>
           </w:tcPr>
           <w:p>
             <w:pPr>
@@ -3016,40 +3359,15 @@
                 <w:b w:val="0"/>
                 <w:i w:val="0"/>
                 <w:color w:val="1B2610"/>
-                <w:sz w:val="19"/>
+                <w:sz w:val="18"/>
               </w:rPr>
-              <w:t>6 September 2026</w:t>
-            </w:r>
-          </w:p>
-        </w:tc>
-      </w:tr>
-      <w:tr>
-        <w:trPr>
-          <w:cantSplit/>
-        </w:trPr>
-        <w:tc>
-          <w:tcPr>
-            <w:tcW w:type="dxa" w:w="2551"/>
-          </w:tcPr>
-          <w:p>
-            <w:pPr>
-              <w:spacing w:after="0"/>
-            </w:pPr>
-            <w:r>
-              <w:rPr>
-                <w:rFonts w:ascii="Arial" w:hAnsi="Arial"/>
-                <w:b/>
-                <w:i w:val="0"/>
-                <w:color w:val="FD6902"/>
-                <w:sz w:val="19"/>
-              </w:rPr>
-              <w:t>Families</w:t>
+              <w:t>SNTV (@sntvnews1)</w:t>
             </w:r>
           </w:p>
         </w:tc>
         <w:tc>
           <w:tcPr>
-            <w:tcW w:type="dxa" w:w="6236"/>
+            <w:tcW w:type="dxa" w:w="1020"/>
           </w:tcPr>
           <w:p>
             <w:pPr>
@@ -3061,44 +3379,20 @@
                 <w:b w:val="0"/>
                 <w:i w:val="0"/>
                 <w:color w:val="1B2610"/>
-                <w:sz w:val="19"/>
+                <w:sz w:val="18"/>
               </w:rPr>
-              <w:t>200</w:t>
-            </w:r>
-          </w:p>
-        </w:tc>
-      </w:tr>
-      <w:tr>
-        <w:trPr>
-          <w:cantSplit/>
-        </w:trPr>
-        <w:tc>
-          <w:tcPr>
-            <w:tcW w:type="dxa" w:w="2551"/>
-          </w:tcPr>
-          <w:p>
-            <w:pPr>
-              <w:spacing w:after="0"/>
-            </w:pPr>
-            <w:r>
-              <w:rPr>
-                <w:rFonts w:ascii="Arial" w:hAnsi="Arial"/>
-                <w:b/>
-                <w:i w:val="0"/>
-                <w:color w:val="FD6902"/>
-                <w:sz w:val="19"/>
-              </w:rPr>
-              <w:t>Media provided</w:t>
+              <w:t>TikTok</w:t>
             </w:r>
           </w:p>
         </w:tc>
         <w:tc>
           <w:tcPr>
-            <w:tcW w:type="dxa" w:w="6236"/>
+            <w:tcW w:type="dxa" w:w="794"/>
           </w:tcPr>
           <w:p>
             <w:pPr>
               <w:spacing w:after="0"/>
+              <w:jc w:val="center"/>
             </w:pPr>
             <w:r>
               <w:rPr>
@@ -3106,46 +3400,21 @@
                 <w:b w:val="0"/>
                 <w:i w:val="0"/>
                 <w:color w:val="1B2610"/>
-                <w:sz w:val="19"/>
+                <w:sz w:val="18"/>
               </w:rPr>
-              <w:t>Photography and video coverage of the ceremony</w:t>
+              <w:t>50.4K plays</w:t>
             </w:r>
           </w:p>
         </w:tc>
-      </w:tr>
-      <w:tr>
-        <w:trPr>
-          <w:cantSplit/>
-        </w:trPr>
         <w:tc>
           <w:tcPr>
-            <w:tcW w:type="dxa" w:w="2551"/>
+            <w:tcW w:type="dxa" w:w="2665"/>
           </w:tcPr>
           <w:p>
             <w:pPr>
               <w:spacing w:after="0"/>
             </w:pPr>
-            <w:r>
-              <w:rPr>
-                <w:rFonts w:ascii="Arial" w:hAnsi="Arial"/>
-                <w:b/>
-                <w:i w:val="0"/>
-                <w:color w:val="FD6902"/>
-                <w:sz w:val="19"/>
-              </w:rPr>
-              <w:t>Photos and videos</w:t>
-            </w:r>
-          </w:p>
-        </w:tc>
-        <w:tc>
-          <w:tcPr>
-            <w:tcW w:type="dxa" w:w="6236"/>
-          </w:tcPr>
-          <w:p>
-            <w:pPr>
-              <w:spacing w:after="0"/>
-            </w:pPr>
-            <w:hyperlink r:id="rId15">
+            <w:hyperlink r:id="rId17">
               <w:r>
                 <w:rPr>
                   <w:rFonts w:ascii="Arial" w:hAnsi="Arial" w:cs="Arial"/>
@@ -3153,7 +3422,7 @@
                   <w:sz w:val="17"/>
                   <w:u w:val="single"/>
                 </w:rPr>
-                <w:t>https://www.facebook.com/reel/916665714471740</w:t>
+                <w:t>vt.tiktok.com/ZSqhyFG6W/</w:t>
               </w:r>
             </w:hyperlink>
           </w:p>

</xml_diff>

<commit_message>
Banadir report: add four photos to Annex A
Co-Authored-By: Claude Sonnet 5.5 <noreply@anthropic.com>
Claude-Session: https://claude.ai/code/session_01B6RPWkBpLKoctTdaNtAabD
</commit_message>
<xml_diff>
--- a/state_reports/Rasmi_Event_Management_Report_HoA_DRIVE_Banadir.docx
+++ b/state_reports/Rasmi_Event_Management_Report_HoA_DRIVE_Banadir.docx
@@ -3434,6 +3434,284 @@
         <w:spacing w:after="40"/>
       </w:pPr>
     </w:p>
+    <w:p>
+      <w:pPr>
+        <w:pStyle w:val="Heading2"/>
+      </w:pPr>
+      <w:r>
+        <w:t>Photos</w:t>
+      </w:r>
+    </w:p>
+    <w:tbl>
+      <w:tblPr>
+        <w:tblW w:type="auto" w:w="0"/>
+        <w:jc w:val="center"/>
+        <w:tblLayout w:type="fixed"/>
+        <w:tblLook w:firstColumn="1" w:firstRow="1" w:lastColumn="0" w:lastRow="0" w:noHBand="0" w:noVBand="1" w:val="04A0"/>
+      </w:tblPr>
+      <w:tblGrid>
+        <w:gridCol w:w="4706"/>
+        <w:gridCol w:w="4706"/>
+      </w:tblGrid>
+      <w:tr>
+        <w:trPr>
+          <w:cantSplit/>
+        </w:trPr>
+        <w:tc>
+          <w:tcPr>
+            <w:tcW w:type="dxa" w:w="4535"/>
+          </w:tcPr>
+          <w:p>
+            <w:pPr>
+              <w:keepNext/>
+              <w:spacing w:after="40"/>
+              <w:jc w:val="center"/>
+            </w:pPr>
+            <w:r>
+              <w:drawing>
+                <wp:inline xmlns:a="http://schemas.openxmlformats.org/drawingml/2006/main" xmlns:pic="http://schemas.openxmlformats.org/drawingml/2006/picture">
+                  <wp:extent cx="2808000" cy="1353713"/>
+                  <wp:docPr id="4" name="Picture 4"/>
+                  <wp:cNvGraphicFramePr>
+                    <a:graphicFrameLocks noChangeAspect="1"/>
+                  </wp:cNvGraphicFramePr>
+                  <a:graphic>
+                    <a:graphicData uri="http://schemas.openxmlformats.org/drawingml/2006/picture">
+                      <pic:pic>
+                        <pic:nvPicPr>
+                          <pic:cNvPr id="0" name="photo1.jpg"/>
+                          <pic:cNvPicPr/>
+                        </pic:nvPicPr>
+                        <pic:blipFill>
+                          <a:blip r:embed="rId18"/>
+                          <a:stretch>
+                            <a:fillRect/>
+                          </a:stretch>
+                        </pic:blipFill>
+                        <pic:spPr>
+                          <a:xfrm>
+                            <a:off x="0" y="0"/>
+                            <a:ext cx="2808000" cy="1353713"/>
+                          </a:xfrm>
+                          <a:prstGeom prst="rect"/>
+                        </pic:spPr>
+                      </pic:pic>
+                    </a:graphicData>
+                  </a:graphic>
+                </wp:inline>
+              </w:drawing>
+            </w:r>
+          </w:p>
+          <w:p>
+            <w:pPr>
+              <w:spacing w:after="160"/>
+              <w:jc w:val="center"/>
+            </w:pPr>
+            <w:r>
+              <w:rPr>
+                <w:rFonts w:ascii="Arial" w:hAnsi="Arial"/>
+                <w:b w:val="0"/>
+                <w:i/>
+                <w:color w:val="555F4A"/>
+                <w:sz w:val="17"/>
+              </w:rPr>
+              <w:t>Solar fridge units lined up beside solar panels laid out on the ground.</w:t>
+            </w:r>
+          </w:p>
+        </w:tc>
+        <w:tc>
+          <w:tcPr>
+            <w:tcW w:type="dxa" w:w="4535"/>
+          </w:tcPr>
+          <w:p>
+            <w:pPr>
+              <w:keepNext/>
+              <w:spacing w:after="40"/>
+              <w:jc w:val="center"/>
+            </w:pPr>
+            <w:r>
+              <w:drawing>
+                <wp:inline xmlns:a="http://schemas.openxmlformats.org/drawingml/2006/main" xmlns:pic="http://schemas.openxmlformats.org/drawingml/2006/picture">
+                  <wp:extent cx="2808000" cy="1384656"/>
+                  <wp:docPr id="5" name="Picture 5"/>
+                  <wp:cNvGraphicFramePr>
+                    <a:graphicFrameLocks noChangeAspect="1"/>
+                  </wp:cNvGraphicFramePr>
+                  <a:graphic>
+                    <a:graphicData uri="http://schemas.openxmlformats.org/drawingml/2006/picture">
+                      <pic:pic>
+                        <pic:nvPicPr>
+                          <pic:cNvPr id="0" name="photo2.jpg"/>
+                          <pic:cNvPicPr/>
+                        </pic:nvPicPr>
+                        <pic:blipFill>
+                          <a:blip r:embed="rId19"/>
+                          <a:stretch>
+                            <a:fillRect/>
+                          </a:stretch>
+                        </pic:blipFill>
+                        <pic:spPr>
+                          <a:xfrm>
+                            <a:off x="0" y="0"/>
+                            <a:ext cx="2808000" cy="1384656"/>
+                          </a:xfrm>
+                          <a:prstGeom prst="rect"/>
+                        </pic:spPr>
+                      </pic:pic>
+                    </a:graphicData>
+                  </a:graphic>
+                </wp:inline>
+              </w:drawing>
+            </w:r>
+          </w:p>
+          <w:p>
+            <w:pPr>
+              <w:spacing w:after="160"/>
+              <w:jc w:val="center"/>
+            </w:pPr>
+            <w:r>
+              <w:rPr>
+                <w:rFonts w:ascii="Arial" w:hAnsi="Arial"/>
+                <w:b w:val="0"/>
+                <w:i/>
+                <w:color w:val="555F4A"/>
+                <w:sz w:val="17"/>
+              </w:rPr>
+              <w:t>Solar panels laid out on cardboard, with their cables.</w:t>
+            </w:r>
+          </w:p>
+        </w:tc>
+      </w:tr>
+      <w:tr>
+        <w:trPr>
+          <w:cantSplit/>
+        </w:trPr>
+        <w:tc>
+          <w:tcPr>
+            <w:tcW w:type="dxa" w:w="4535"/>
+          </w:tcPr>
+          <w:p>
+            <w:pPr>
+              <w:keepNext/>
+              <w:spacing w:after="40"/>
+              <w:jc w:val="center"/>
+            </w:pPr>
+            <w:r>
+              <w:drawing>
+                <wp:inline xmlns:a="http://schemas.openxmlformats.org/drawingml/2006/main" xmlns:pic="http://schemas.openxmlformats.org/drawingml/2006/picture">
+                  <wp:extent cx="1944000" cy="1586898"/>
+                  <wp:docPr id="6" name="Picture 6"/>
+                  <wp:cNvGraphicFramePr>
+                    <a:graphicFrameLocks noChangeAspect="1"/>
+                  </wp:cNvGraphicFramePr>
+                  <a:graphic>
+                    <a:graphicData uri="http://schemas.openxmlformats.org/drawingml/2006/picture">
+                      <pic:pic>
+                        <pic:nvPicPr>
+                          <pic:cNvPr id="0" name="photo3.jpg"/>
+                          <pic:cNvPicPr/>
+                        </pic:nvPicPr>
+                        <pic:blipFill>
+                          <a:blip r:embed="rId20"/>
+                          <a:stretch>
+                            <a:fillRect/>
+                          </a:stretch>
+                        </pic:blipFill>
+                        <pic:spPr>
+                          <a:xfrm>
+                            <a:off x="0" y="0"/>
+                            <a:ext cx="1944000" cy="1586898"/>
+                          </a:xfrm>
+                          <a:prstGeom prst="rect"/>
+                        </pic:spPr>
+                      </pic:pic>
+                    </a:graphicData>
+                  </a:graphic>
+                </wp:inline>
+              </w:drawing>
+            </w:r>
+          </w:p>
+          <w:p>
+            <w:pPr>
+              <w:spacing w:after="160"/>
+              <w:jc w:val="center"/>
+            </w:pPr>
+            <w:r>
+              <w:rPr>
+                <w:rFonts w:ascii="Arial" w:hAnsi="Arial"/>
+                <w:b w:val="0"/>
+                <w:i/>
+                <w:color w:val="555F4A"/>
+                <w:sz w:val="17"/>
+              </w:rPr>
+              <w:t>Two stainless steel 20-litre milk cans on their box.</w:t>
+            </w:r>
+          </w:p>
+        </w:tc>
+        <w:tc>
+          <w:tcPr>
+            <w:tcW w:type="dxa" w:w="4535"/>
+          </w:tcPr>
+          <w:p>
+            <w:pPr>
+              <w:keepNext/>
+              <w:spacing w:after="40"/>
+              <w:jc w:val="center"/>
+            </w:pPr>
+            <w:r>
+              <w:drawing>
+                <wp:inline xmlns:a="http://schemas.openxmlformats.org/drawingml/2006/main" xmlns:pic="http://schemas.openxmlformats.org/drawingml/2006/picture">
+                  <wp:extent cx="2808000" cy="1309756"/>
+                  <wp:docPr id="7" name="Picture 7"/>
+                  <wp:cNvGraphicFramePr>
+                    <a:graphicFrameLocks noChangeAspect="1"/>
+                  </wp:cNvGraphicFramePr>
+                  <a:graphic>
+                    <a:graphicData uri="http://schemas.openxmlformats.org/drawingml/2006/picture">
+                      <pic:pic>
+                        <pic:nvPicPr>
+                          <pic:cNvPr id="0" name="photo4.jpg"/>
+                          <pic:cNvPicPr/>
+                        </pic:nvPicPr>
+                        <pic:blipFill>
+                          <a:blip r:embed="rId21"/>
+                          <a:stretch>
+                            <a:fillRect/>
+                          </a:stretch>
+                        </pic:blipFill>
+                        <pic:spPr>
+                          <a:xfrm>
+                            <a:off x="0" y="0"/>
+                            <a:ext cx="2808000" cy="1309756"/>
+                          </a:xfrm>
+                          <a:prstGeom prst="rect"/>
+                        </pic:spPr>
+                      </pic:pic>
+                    </a:graphicData>
+                  </a:graphic>
+                </wp:inline>
+              </w:drawing>
+            </w:r>
+          </w:p>
+          <w:p>
+            <w:pPr>
+              <w:spacing w:after="160"/>
+              <w:jc w:val="center"/>
+            </w:pPr>
+            <w:r>
+              <w:rPr>
+                <w:rFonts w:ascii="Arial" w:hAnsi="Arial"/>
+                <w:b w:val="0"/>
+                <w:i/>
+                <w:color w:val="555F4A"/>
+                <w:sz w:val="17"/>
+              </w:rPr>
+              <w:t>Boxed solar fridges, batteries and milk cans staged in rows in a yard.</w:t>
+            </w:r>
+          </w:p>
+        </w:tc>
+      </w:tr>
+    </w:tbl>
     <w:sectPr>
       <w:headerReference w:type="default" r:id="rId9"/>
       <w:footerReference w:type="default" r:id="rId10"/>

</xml_diff>